<commit_message>
Updated address to new apartment
</commit_message>
<xml_diff>
--- a/primaryResumeOttawa.docx
+++ b/primaryResumeOttawa.docx
@@ -34,16 +34,19 @@
           <w:tab w:val="left" w:pos="2833" w:leader="none"/>
           <w:tab w:val="right" w:pos="9360" w:leader="none"/>
         </w:tabs>
-        <w:rPr>
-          <w:rFonts w:ascii="Calibri" w:hAnsi="Calibri" w:cs="Calibri"/>
-          <w:b w:val="false"/>
+        <w:rPr/>
+      </w:pPr>
+      <w:r>
+        <w:rPr>
+          <w:rFonts w:cs="Calibri" w:ascii="Calibri" w:hAnsi="Calibri"/>
           <w:b w:val="false"/>
           <w:bCs/>
           <w:sz w:val="24"/>
           <w:szCs w:val="24"/>
           <w:lang w:val="en-CA"/>
         </w:rPr>
-      </w:pPr>
+        <w:t>740 Springland Dr. Unit 515</w:t>
+      </w:r>
       <w:r>
         <w:rPr>
           <w:rFonts w:cs="Calibri" w:ascii="Calibri" w:hAnsi="Calibri"/>
@@ -53,7 +56,7 @@
           <w:szCs w:val="24"/>
           <w:lang w:val="en-CA"/>
         </w:rPr>
-        <w:t>562 Reardon Private, Ottawa, Ontario</w:t>
+        <w:t>, Ottawa, Ontario</w:t>
       </w:r>
     </w:p>
     <w:tbl>

</xml_diff>

<commit_message>
update address, convert for Toronto & ended employment as IT & Media Arts ...
</commit_message>
<xml_diff>
--- a/primaryResumeOttawa.docx
+++ b/primaryResumeOttawa.docx
@@ -34,19 +34,16 @@
           <w:tab w:val="left" w:pos="2833" w:leader="none"/>
           <w:tab w:val="right" w:pos="9360" w:leader="none"/>
         </w:tabs>
-        <w:rPr/>
-      </w:pPr>
-      <w:r>
-        <w:rPr>
-          <w:rFonts w:cs="Calibri" w:ascii="Calibri" w:hAnsi="Calibri"/>
+        <w:rPr>
+          <w:rFonts w:ascii="Calibri" w:hAnsi="Calibri" w:cs="Calibri"/>
+          <w:b w:val="false"/>
           <w:b w:val="false"/>
           <w:bCs/>
           <w:sz w:val="24"/>
           <w:szCs w:val="24"/>
           <w:lang w:val="en-CA"/>
         </w:rPr>
-        <w:t>740 Springland Dr. Unit 515</w:t>
-      </w:r>
+      </w:pPr>
       <w:r>
         <w:rPr>
           <w:rFonts w:cs="Calibri" w:ascii="Calibri" w:hAnsi="Calibri"/>
@@ -56,7 +53,7 @@
           <w:szCs w:val="24"/>
           <w:lang w:val="en-CA"/>
         </w:rPr>
-        <w:t>, Ottawa, Ontario</w:t>
+        <w:t>740 Springland Dr., Apt. 515, Ottawa, Ontario</w:t>
       </w:r>
     </w:p>
     <w:tbl>
@@ -1130,7 +1127,14 @@
           <w:lang w:val="en-CA"/>
         </w:rPr>
         <w:tab/>
-        <w:t>June 2012 – Present</w:t>
+        <w:t xml:space="preserve">June 2012 – </w:t>
+      </w:r>
+      <w:r>
+        <w:rPr>
+          <w:rFonts w:cs="Calibri" w:ascii="Calibri" w:hAnsi="Calibri"/>
+          <w:lang w:val="en-CA"/>
+        </w:rPr>
+        <w:t>September 2020</w:t>
       </w:r>
     </w:p>
     <w:p>

</xml_diff>

<commit_message>
added certificates to full resume, removed fox digital due to how long ago it was and, company may have ceased to exist
</commit_message>
<xml_diff>
--- a/primaryResumeOttawa.docx
+++ b/primaryResumeOttawa.docx
@@ -61,6 +61,7 @@
         <w:tblW w:w="4386" w:type="dxa"/>
         <w:jc w:val="center"/>
         <w:tblInd w:w="0" w:type="dxa"/>
+        <w:tblLayout w:type="fixed"/>
         <w:tblCellMar>
           <w:top w:w="55" w:type="dxa"/>
           <w:left w:w="55" w:type="dxa"/>
@@ -171,7 +172,21 @@
           <w:rFonts w:cs="Calibri" w:ascii="Calibri" w:hAnsi="Calibri"/>
           <w:lang w:val="en-CA"/>
         </w:rPr>
-        <w:t>Secret Level Security Clearance.</w:t>
+        <w:t xml:space="preserve">Applied computer science </w:t>
+      </w:r>
+      <w:r>
+        <w:rPr>
+          <w:rFonts w:cs="Calibri" w:ascii="Calibri" w:hAnsi="Calibri"/>
+          <w:lang w:val="en-CA"/>
+        </w:rPr>
+        <w:t>and</w:t>
+      </w:r>
+      <w:r>
+        <w:rPr>
+          <w:rFonts w:cs="Calibri" w:ascii="Calibri" w:hAnsi="Calibri"/>
+          <w:lang w:val="en-CA"/>
+        </w:rPr>
+        <w:t xml:space="preserve"> broad general science education and experience.</w:t>
       </w:r>
     </w:p>
     <w:p>
@@ -195,21 +210,7 @@
           <w:rFonts w:cs="Calibri" w:ascii="Calibri" w:hAnsi="Calibri"/>
           <w:lang w:val="en-CA"/>
         </w:rPr>
-        <w:t xml:space="preserve">Applied computer science </w:t>
-      </w:r>
-      <w:r>
-        <w:rPr>
-          <w:rFonts w:cs="Calibri" w:ascii="Calibri" w:hAnsi="Calibri"/>
-          <w:lang w:val="en-CA"/>
-        </w:rPr>
-        <w:t>and</w:t>
-      </w:r>
-      <w:r>
-        <w:rPr>
-          <w:rFonts w:cs="Calibri" w:ascii="Calibri" w:hAnsi="Calibri"/>
-          <w:lang w:val="en-CA"/>
-        </w:rPr>
-        <w:t xml:space="preserve"> broad general science education and experience.</w:t>
+        <w:t>Working at Shoppers Drug Mart until a career opportunity</w:t>
       </w:r>
     </w:p>
     <w:p>
@@ -229,6 +230,25 @@
           <w:szCs w:val="22"/>
           <w:lang w:val="en-CA"/>
         </w:rPr>
+      </w:r>
+    </w:p>
+    <w:p>
+      <w:pPr>
+        <w:pStyle w:val="Heading1"/>
+        <w:rPr>
+          <w:rFonts w:ascii="Calibri" w:hAnsi="Calibri" w:cs="Calibri"/>
+          <w:sz w:val="22"/>
+          <w:szCs w:val="22"/>
+          <w:lang w:val="en-CA"/>
+        </w:rPr>
+      </w:pPr>
+      <w:r>
+        <w:rPr>
+          <w:rFonts w:cs="Calibri" w:ascii="Calibri" w:hAnsi="Calibri"/>
+          <w:sz w:val="22"/>
+          <w:szCs w:val="22"/>
+          <w:lang w:val="en-CA"/>
+        </w:rPr>
         <w:t>Education</w:t>
       </w:r>
     </w:p>
@@ -374,6 +394,200 @@
           <w:szCs w:val="22"/>
           <w:lang w:val="en-CA"/>
         </w:rPr>
+        <w:t>Certificates</w:t>
+      </w:r>
+    </w:p>
+    <w:p>
+      <w:pPr>
+        <w:pStyle w:val="Normal"/>
+        <w:spacing w:before="120" w:after="0"/>
+        <w:rPr/>
+      </w:pPr>
+      <w:r>
+        <w:rPr>
+          <w:rStyle w:val="NormalBold"/>
+          <w:rFonts w:cs="Calibri" w:ascii="Calibri" w:hAnsi="Calibri"/>
+          <w:b/>
+          <w:lang w:val="en-CA"/>
+        </w:rPr>
+        <w:t>Coursera Course</w:t>
+      </w:r>
+      <w:r>
+        <w:rPr>
+          <w:rStyle w:val="NormalBold"/>
+          <w:rFonts w:cs="Calibri" w:ascii="Calibri" w:hAnsi="Calibri"/>
+          <w:lang w:val="en-CA"/>
+        </w:rPr>
+        <w:tab/>
+      </w:r>
+      <w:r>
+        <w:rPr>
+          <w:rStyle w:val="NormalBold"/>
+          <w:rFonts w:cs="Calibri" w:ascii="Calibri" w:hAnsi="Calibri"/>
+          <w:b w:val="false"/>
+          <w:bCs w:val="false"/>
+          <w:lang w:val="en-CA"/>
+        </w:rPr>
+        <w:t>Virtual</w:t>
+      </w:r>
+    </w:p>
+    <w:p>
+      <w:pPr>
+        <w:pStyle w:val="Normal"/>
+        <w:spacing w:before="0" w:after="0"/>
+        <w:rPr/>
+      </w:pPr>
+      <w:r>
+        <w:rPr>
+          <w:rStyle w:val="NormalItalic"/>
+          <w:rFonts w:cs="Calibri" w:ascii="Calibri" w:hAnsi="Calibri"/>
+          <w:lang w:val="en-CA"/>
+        </w:rPr>
+        <w:t>R Programming by</w:t>
+      </w:r>
+      <w:r>
+        <w:rPr>
+          <w:rStyle w:val="NormalItalic"/>
+          <w:rFonts w:cs="Calibri" w:ascii="Calibri" w:hAnsi="Calibri"/>
+          <w:lang w:val="en-CA"/>
+        </w:rPr>
+        <w:t xml:space="preserve"> </w:t>
+      </w:r>
+      <w:r>
+        <w:rPr>
+          <w:rStyle w:val="NormalItalic"/>
+          <w:rFonts w:cs="Calibri" w:ascii="Calibri" w:hAnsi="Calibri"/>
+          <w:lang w:val="en-CA"/>
+        </w:rPr>
+        <w:t>Johns Hopkins University</w:t>
+      </w:r>
+      <w:r>
+        <w:rPr>
+          <w:rFonts w:cs="Calibri" w:ascii="Calibri" w:hAnsi="Calibri"/>
+          <w:lang w:val="en-CA"/>
+        </w:rPr>
+        <w:tab/>
+      </w:r>
+      <w:r>
+        <w:rPr>
+          <w:rFonts w:cs="Calibri" w:ascii="Calibri" w:hAnsi="Calibri"/>
+          <w:lang w:val="en-CA"/>
+        </w:rPr>
+        <w:t>2020</w:t>
+      </w:r>
+    </w:p>
+    <w:p>
+      <w:pPr>
+        <w:pStyle w:val="Normal"/>
+        <w:spacing w:before="0" w:after="0"/>
+        <w:rPr>
+          <w:rStyle w:val="NormalBold"/>
+        </w:rPr>
+      </w:pPr>
+      <w:r>
+        <w:rPr/>
+      </w:r>
+    </w:p>
+    <w:p>
+      <w:pPr>
+        <w:pStyle w:val="Normal"/>
+        <w:spacing w:before="0" w:after="0"/>
+        <w:rPr/>
+      </w:pPr>
+      <w:r>
+        <w:rPr>
+          <w:rStyle w:val="NormalBold"/>
+          <w:rFonts w:cs="Calibri" w:ascii="Calibri" w:hAnsi="Calibri"/>
+          <w:lang w:val="en-CA"/>
+        </w:rPr>
+        <w:t>Public Works and Government Services Canada</w:t>
+      </w:r>
+      <w:r>
+        <w:rPr>
+          <w:rFonts w:cs="Calibri" w:ascii="Calibri" w:hAnsi="Calibri"/>
+          <w:lang w:val="en-CA"/>
+        </w:rPr>
+        <w:tab/>
+        <w:t>Ottawa</w:t>
+      </w:r>
+    </w:p>
+    <w:p>
+      <w:pPr>
+        <w:pStyle w:val="Normal"/>
+        <w:spacing w:before="0" w:after="0"/>
+        <w:rPr/>
+      </w:pPr>
+      <w:r>
+        <w:rPr>
+          <w:rStyle w:val="NormalItalic"/>
+          <w:rFonts w:cs="Calibri" w:ascii="Calibri" w:hAnsi="Calibri"/>
+          <w:i/>
+          <w:sz w:val="22"/>
+          <w:szCs w:val="22"/>
+          <w:lang w:val="en-CA"/>
+        </w:rPr>
+        <w:t xml:space="preserve">II – Secret Security Clearance </w:t>
+      </w:r>
+      <w:r>
+        <w:rPr>
+          <w:rStyle w:val="NormalItalic"/>
+          <w:rFonts w:cs="Calibri" w:ascii="Calibri" w:hAnsi="Calibri"/>
+          <w:i/>
+          <w:sz w:val="22"/>
+          <w:szCs w:val="22"/>
+          <w:lang w:val="en-CA"/>
+        </w:rPr>
+        <w:t>issued for Dynamic Personal Consultants (recruiters)</w:t>
+      </w:r>
+      <w:r>
+        <w:rPr>
+          <w:rFonts w:cs="Calibri" w:ascii="Calibri" w:hAnsi="Calibri"/>
+          <w:sz w:val="22"/>
+          <w:szCs w:val="22"/>
+          <w:lang w:val="en-CA"/>
+        </w:rPr>
+        <w:tab/>
+        <w:t>2019</w:t>
+      </w:r>
+    </w:p>
+    <w:p>
+      <w:pPr>
+        <w:pStyle w:val="Heading1"/>
+        <w:spacing w:before="120" w:after="0"/>
+        <w:rPr>
+          <w:rFonts w:ascii="Calibri" w:hAnsi="Calibri" w:cs="Calibri"/>
+          <w:sz w:val="22"/>
+          <w:szCs w:val="22"/>
+          <w:lang w:val="en-CA"/>
+        </w:rPr>
+      </w:pPr>
+      <w:r>
+        <w:rPr>
+          <w:rFonts w:cs="Calibri" w:ascii="Calibri" w:hAnsi="Calibri"/>
+          <w:sz w:val="22"/>
+          <w:szCs w:val="22"/>
+          <w:lang w:val="en-CA"/>
+        </w:rPr>
+      </w:r>
+    </w:p>
+    <w:p>
+      <w:pPr>
+        <w:pStyle w:val="Heading1"/>
+        <w:spacing w:before="120" w:after="0"/>
+        <w:rPr>
+          <w:rFonts w:ascii="Calibri" w:hAnsi="Calibri" w:cs="Calibri"/>
+          <w:sz w:val="22"/>
+          <w:szCs w:val="22"/>
+          <w:lang w:val="en-CA"/>
+        </w:rPr>
+      </w:pPr>
+      <w:r>
+        <w:rPr>
+          <w:rFonts w:cs="Calibri" w:ascii="Calibri" w:hAnsi="Calibri"/>
+          <w:sz w:val="22"/>
+          <w:szCs w:val="22"/>
+          <w:lang w:val="en-CA"/>
+        </w:rPr>
         <w:t>Technology Skills</w:t>
       </w:r>
     </w:p>
@@ -731,6 +945,28 @@
     </w:p>
     <w:p>
       <w:pPr>
+        <w:pStyle w:val="Normal"/>
+        <w:tabs>
+          <w:tab w:val="clear" w:pos="9360"/>
+        </w:tabs>
+        <w:spacing w:before="0" w:after="0"/>
+        <w:rPr>
+          <w:rFonts w:ascii="Calibri" w:hAnsi="Calibri" w:cs="Calibri"/>
+          <w:lang w:val="en-CA"/>
+        </w:rPr>
+      </w:pPr>
+      <w:r>
+        <w:rPr>
+          <w:rFonts w:cs="Calibri" w:ascii="Calibri" w:hAnsi="Calibri"/>
+          <w:lang w:val="en-CA"/>
+        </w:rPr>
+      </w:r>
+      <w:r>
+        <w:br w:type="page"/>
+      </w:r>
+    </w:p>
+    <w:p>
+      <w:pPr>
         <w:pStyle w:val="Heading1"/>
         <w:rPr>
           <w:rFonts w:ascii="Calibri" w:hAnsi="Calibri" w:cs="Calibri"/>
@@ -746,25 +982,6 @@
           <w:szCs w:val="22"/>
           <w:lang w:val="en-CA"/>
         </w:rPr>
-      </w:r>
-    </w:p>
-    <w:p>
-      <w:pPr>
-        <w:pStyle w:val="Heading1"/>
-        <w:rPr>
-          <w:rFonts w:ascii="Calibri" w:hAnsi="Calibri" w:cs="Calibri"/>
-          <w:sz w:val="22"/>
-          <w:szCs w:val="22"/>
-          <w:lang w:val="en-CA"/>
-        </w:rPr>
-      </w:pPr>
-      <w:r>
-        <w:rPr>
-          <w:rFonts w:cs="Calibri" w:ascii="Calibri" w:hAnsi="Calibri"/>
-          <w:sz w:val="22"/>
-          <w:szCs w:val="22"/>
-          <w:lang w:val="en-CA"/>
-        </w:rPr>
         <w:t>Professional Experience</w:t>
       </w:r>
     </w:p>
@@ -868,22 +1085,6 @@
     <w:p>
       <w:pPr>
         <w:pStyle w:val="Normal"/>
-        <w:rPr>
-          <w:rStyle w:val="NormalItalic"/>
-          <w:rFonts w:ascii="Calibri" w:hAnsi="Calibri" w:cs="Calibri"/>
-          <w:lang w:val="en-CA"/>
-        </w:rPr>
-      </w:pPr>
-      <w:r>
-        <w:rPr>
-          <w:rFonts w:cs="Calibri" w:ascii="Calibri" w:hAnsi="Calibri"/>
-          <w:lang w:val="en-CA"/>
-        </w:rPr>
-      </w:r>
-    </w:p>
-    <w:p>
-      <w:pPr>
-        <w:pStyle w:val="Normal"/>
         <w:rPr/>
       </w:pPr>
       <w:r>
@@ -1041,8 +1242,215 @@
     <w:p>
       <w:pPr>
         <w:pStyle w:val="Normal"/>
+        <w:rPr/>
+      </w:pPr>
+      <w:r>
         <w:rPr>
           <w:rStyle w:val="NormalBold"/>
+          <w:rFonts w:cs="Calibri" w:ascii="Calibri" w:hAnsi="Calibri"/>
+          <w:lang w:val="en-CA"/>
+        </w:rPr>
+        <w:t>Canada Computers</w:t>
+      </w:r>
+      <w:r>
+        <w:rPr>
+          <w:rFonts w:cs="Calibri" w:ascii="Calibri" w:hAnsi="Calibri"/>
+          <w:lang w:val="en-CA"/>
+        </w:rPr>
+        <w:tab/>
+        <w:t>Mississauga ON, Canada</w:t>
+      </w:r>
+    </w:p>
+    <w:p>
+      <w:pPr>
+        <w:pStyle w:val="ListParagraph"/>
+        <w:spacing w:before="120" w:after="0"/>
+        <w:rPr>
+          <w:rFonts w:ascii="Calibri" w:hAnsi="Calibri" w:cs="Calibri"/>
+          <w:color w:val="000000"/>
+        </w:rPr>
+      </w:pPr>
+      <w:r>
+        <w:rPr>
+          <w:rFonts w:cs="Calibri" w:ascii="Calibri" w:hAnsi="Calibri"/>
+          <w:color w:val="000000"/>
+        </w:rPr>
+        <w:t>Founded in 1991, Canada Computers &amp; Electronics is a retailer of personal computers, IT and components, as well as consumer electronics.</w:t>
+      </w:r>
+    </w:p>
+    <w:p>
+      <w:pPr>
+        <w:pStyle w:val="Normal"/>
+        <w:rPr/>
+      </w:pPr>
+      <w:r>
+        <w:rPr>
+          <w:rStyle w:val="NormalItalic"/>
+          <w:rFonts w:cs="Calibri" w:ascii="Calibri" w:hAnsi="Calibri"/>
+          <w:lang w:val="en-CA"/>
+        </w:rPr>
+        <w:t>Customer Service Representative</w:t>
+      </w:r>
+      <w:r>
+        <w:rPr>
+          <w:rFonts w:cs="Calibri" w:ascii="Calibri" w:hAnsi="Calibri"/>
+          <w:lang w:val="en-CA"/>
+        </w:rPr>
+        <w:tab/>
+        <w:t>June 2014 – August 2015</w:t>
+      </w:r>
+    </w:p>
+    <w:p>
+      <w:pPr>
+        <w:pStyle w:val="ListParagraph"/>
+        <w:rPr/>
+      </w:pPr>
+      <w:r>
+        <w:rPr>
+          <w:rFonts w:cs="Calibri" w:ascii="Calibri" w:hAnsi="Calibri"/>
+          <w:u w:val="single"/>
+          <w:lang w:val="en-CA"/>
+        </w:rPr>
+        <w:t>Key Responsibilities</w:t>
+      </w:r>
+      <w:r>
+        <w:rPr>
+          <w:rFonts w:cs="Calibri" w:ascii="Calibri" w:hAnsi="Calibri"/>
+          <w:lang w:val="en-CA"/>
+        </w:rPr>
+        <w:t>:</w:t>
+      </w:r>
+    </w:p>
+    <w:p>
+      <w:pPr>
+        <w:pStyle w:val="ListParagraph"/>
+        <w:numPr>
+          <w:ilvl w:val="0"/>
+          <w:numId w:val="5"/>
+        </w:numPr>
+        <w:spacing w:before="0" w:after="0"/>
+        <w:rPr>
+          <w:rFonts w:ascii="Calibri" w:hAnsi="Calibri" w:cs="Calibri"/>
+          <w:lang w:val="en-CA"/>
+        </w:rPr>
+      </w:pPr>
+      <w:r>
+        <w:rPr>
+          <w:rFonts w:cs="Calibri" w:ascii="Calibri" w:hAnsi="Calibri"/>
+          <w:lang w:val="en-CA"/>
+        </w:rPr>
+        <w:t xml:space="preserve">Service Desk representative responsible for aiding clients with troubleshooting technical issues and suggesting appropriate solutions. </w:t>
+      </w:r>
+    </w:p>
+    <w:p>
+      <w:pPr>
+        <w:pStyle w:val="ListParagraph"/>
+        <w:numPr>
+          <w:ilvl w:val="0"/>
+          <w:numId w:val="5"/>
+        </w:numPr>
+        <w:spacing w:before="0" w:after="0"/>
+        <w:rPr>
+          <w:rFonts w:ascii="Calibri" w:hAnsi="Calibri" w:cs="Calibri"/>
+          <w:lang w:val="en-CA"/>
+        </w:rPr>
+      </w:pPr>
+      <w:r>
+        <w:rPr>
+          <w:rFonts w:cs="Calibri" w:ascii="Calibri" w:hAnsi="Calibri"/>
+          <w:lang w:val="en-CA"/>
+        </w:rPr>
+        <w:t>Responsible for assisting clients in finding the right software or hardware to meet their needs.</w:t>
+      </w:r>
+    </w:p>
+    <w:p>
+      <w:pPr>
+        <w:pStyle w:val="ListParagraph"/>
+        <w:numPr>
+          <w:ilvl w:val="0"/>
+          <w:numId w:val="5"/>
+        </w:numPr>
+        <w:spacing w:before="0" w:after="0"/>
+        <w:rPr>
+          <w:rFonts w:ascii="Calibri" w:hAnsi="Calibri" w:cs="Calibri"/>
+          <w:lang w:val="en-CA"/>
+        </w:rPr>
+      </w:pPr>
+      <w:r>
+        <w:rPr>
+          <w:rFonts w:cs="Calibri" w:ascii="Calibri" w:hAnsi="Calibri"/>
+          <w:lang w:val="en-CA"/>
+        </w:rPr>
+        <w:t>Used POS system to order required services and parts for pickup or delivery as well as inventory transfer between customer service department and sales.</w:t>
+      </w:r>
+    </w:p>
+    <w:p>
+      <w:pPr>
+        <w:pStyle w:val="ListParagraph"/>
+        <w:numPr>
+          <w:ilvl w:val="0"/>
+          <w:numId w:val="5"/>
+        </w:numPr>
+        <w:spacing w:before="0" w:after="0"/>
+        <w:rPr>
+          <w:rFonts w:ascii="Calibri" w:hAnsi="Calibri" w:cs="Calibri"/>
+          <w:lang w:val="en-CA"/>
+        </w:rPr>
+      </w:pPr>
+      <w:r>
+        <w:rPr>
+          <w:rFonts w:cs="Calibri" w:ascii="Calibri" w:hAnsi="Calibri"/>
+          <w:lang w:val="en-CA"/>
+        </w:rPr>
+        <w:t xml:space="preserve">Assisted in migrating  customers’ computers from Windows 8 to Windows 10 during transition period. </w:t>
+      </w:r>
+    </w:p>
+    <w:p>
+      <w:pPr>
+        <w:pStyle w:val="ListParagraph"/>
+        <w:numPr>
+          <w:ilvl w:val="0"/>
+          <w:numId w:val="5"/>
+        </w:numPr>
+        <w:spacing w:before="0" w:after="0"/>
+        <w:rPr>
+          <w:rFonts w:ascii="Calibri" w:hAnsi="Calibri" w:cs="Calibri"/>
+          <w:lang w:val="en-CA"/>
+        </w:rPr>
+      </w:pPr>
+      <w:r>
+        <w:rPr>
+          <w:rFonts w:cs="Calibri" w:ascii="Calibri" w:hAnsi="Calibri"/>
+          <w:lang w:val="en-CA"/>
+        </w:rPr>
+        <w:t>Assisted customers with Windows troubleshooting</w:t>
+      </w:r>
+    </w:p>
+    <w:p>
+      <w:pPr>
+        <w:pStyle w:val="ListParagraph"/>
+        <w:numPr>
+          <w:ilvl w:val="0"/>
+          <w:numId w:val="5"/>
+        </w:numPr>
+        <w:spacing w:before="0" w:after="0"/>
+        <w:rPr>
+          <w:rFonts w:ascii="Calibri" w:hAnsi="Calibri" w:cs="Calibri"/>
+          <w:lang w:val="en-CA"/>
+        </w:rPr>
+      </w:pPr>
+      <w:r>
+        <w:rPr>
+          <w:rFonts w:cs="Calibri" w:ascii="Calibri" w:hAnsi="Calibri"/>
+          <w:lang w:val="en-CA"/>
+        </w:rPr>
+        <w:t>Using MiniTool Partition Wizard, I backed up and migrated OS and files to new SSDs and HDDs.</w:t>
+      </w:r>
+    </w:p>
+    <w:p>
+      <w:pPr>
+        <w:pStyle w:val="Normal"/>
+        <w:rPr>
           <w:rFonts w:ascii="Calibri" w:hAnsi="Calibri" w:cs="Calibri"/>
           <w:lang w:val="en-CA"/>
         </w:rPr>
@@ -1089,23 +1497,42 @@
           <w:rFonts w:cs="Calibri" w:ascii="Calibri" w:hAnsi="Calibri"/>
           <w:lang w:val="en-CA"/>
         </w:rPr>
-        <w:t>I-AM Retailer Solutions specializes in advanced retail display solutions, featuring video and mobile advertising capabilities.</w:t>
-      </w:r>
-    </w:p>
-    <w:p>
-      <w:pPr>
-        <w:pStyle w:val="Normal"/>
-        <w:rPr>
-          <w:rStyle w:val="NormalItalic"/>
-          <w:rFonts w:ascii="Calibri" w:hAnsi="Calibri" w:cs="Calibri"/>
-          <w:lang w:val="en-CA"/>
-        </w:rPr>
-      </w:pPr>
-      <w:r>
-        <w:rPr>
-          <w:rFonts w:cs="Calibri" w:ascii="Calibri" w:hAnsi="Calibri"/>
-          <w:lang w:val="en-CA"/>
-        </w:rPr>
+        <w:t>I-AM Retailer Solutions specialize</w:t>
+      </w:r>
+      <w:r>
+        <w:rPr>
+          <w:rFonts w:cs="Calibri" w:ascii="Calibri" w:hAnsi="Calibri"/>
+          <w:lang w:val="en-CA"/>
+        </w:rPr>
+        <w:t>d</w:t>
+      </w:r>
+      <w:r>
+        <w:rPr>
+          <w:rFonts w:cs="Calibri" w:ascii="Calibri" w:hAnsi="Calibri"/>
+          <w:lang w:val="en-CA"/>
+        </w:rPr>
+        <w:t xml:space="preserve"> in advanced retail display solutions, featuring video and mobile advertising capabilities. </w:t>
+      </w:r>
+      <w:r>
+        <w:rPr>
+          <w:rFonts w:cs="Calibri" w:ascii="Calibri" w:hAnsi="Calibri"/>
+          <w:lang w:val="en-CA"/>
+        </w:rPr>
+        <w:t>This business is family related.</w:t>
+      </w:r>
+      <w:r>
+        <w:rPr>
+          <w:rFonts w:cs="Calibri" w:ascii="Calibri" w:hAnsi="Calibri"/>
+          <w:lang w:val="en-CA"/>
+        </w:rPr>
+        <w:t xml:space="preserve"> </w:t>
+      </w:r>
+      <w:r>
+        <w:rPr>
+          <w:rFonts w:cs="Calibri" w:ascii="Calibri" w:hAnsi="Calibri"/>
+          <w:lang w:val="en-CA"/>
+        </w:rPr>
+        <w:t>As of September 2020, all activities with I-AM Retailer Solutions Inc. has ceased. Brick-and-mortar retailers and investors are focused on the pandemic.</w:t>
       </w:r>
     </w:p>
     <w:p>
@@ -1350,14 +1777,8 @@
     <w:p>
       <w:pPr>
         <w:pStyle w:val="ListParagraph"/>
-        <w:numPr>
-          <w:ilvl w:val="0"/>
-          <w:numId w:val="0"/>
-        </w:numPr>
-        <w:spacing w:before="0" w:after="0"/>
-        <w:ind w:left="360" w:hanging="0"/>
-        <w:rPr>
-          <w:rStyle w:val="NormalBold"/>
+        <w:spacing w:before="0" w:after="0"/>
+        <w:rPr>
           <w:rFonts w:ascii="Calibri" w:hAnsi="Calibri" w:cs="Calibri"/>
           <w:lang w:val="en-CA"/>
         </w:rPr>
@@ -1517,7 +1938,6 @@
       <w:pPr>
         <w:pStyle w:val="Normal"/>
         <w:rPr>
-          <w:rStyle w:val="NormalItalic"/>
           <w:rFonts w:ascii="Calibri" w:hAnsi="Calibri" w:cs="Calibri"/>
           <w:lang w:val="en-CA"/>
         </w:rPr>
@@ -1634,231 +2054,13 @@
     </w:p>
     <w:p>
       <w:pPr>
-        <w:pStyle w:val="Normal"/>
-        <w:rPr>
-          <w:rStyle w:val="NormalBold"/>
-          <w:rFonts w:ascii="Calibri" w:hAnsi="Calibri" w:cs="Calibri"/>
-          <w:lang w:val="en-CA"/>
-        </w:rPr>
-      </w:pPr>
-      <w:r>
-        <w:rPr>
-          <w:rFonts w:cs="Calibri" w:ascii="Calibri" w:hAnsi="Calibri"/>
-          <w:lang w:val="en-CA"/>
-        </w:rPr>
-      </w:r>
-    </w:p>
-    <w:p>
-      <w:pPr>
-        <w:pStyle w:val="Normal"/>
-        <w:rPr/>
-      </w:pPr>
-      <w:r>
-        <w:rPr>
-          <w:rStyle w:val="NormalBold"/>
-          <w:rFonts w:cs="Calibri" w:ascii="Calibri" w:hAnsi="Calibri"/>
-          <w:lang w:val="en-CA"/>
-        </w:rPr>
-        <w:t>Canada Computers</w:t>
-      </w:r>
-      <w:r>
-        <w:rPr>
-          <w:rFonts w:cs="Calibri" w:ascii="Calibri" w:hAnsi="Calibri"/>
-          <w:lang w:val="en-CA"/>
-        </w:rPr>
-        <w:tab/>
-        <w:t>Mississauga ON, Canada</w:t>
-      </w:r>
-    </w:p>
-    <w:p>
-      <w:pPr>
-        <w:pStyle w:val="ListParagraph"/>
-        <w:spacing w:before="120" w:after="0"/>
-        <w:rPr>
-          <w:rFonts w:ascii="Calibri" w:hAnsi="Calibri" w:cs="Calibri"/>
-          <w:color w:val="000000"/>
-        </w:rPr>
-      </w:pPr>
-      <w:r>
-        <w:rPr>
-          <w:rFonts w:cs="Calibri" w:ascii="Calibri" w:hAnsi="Calibri"/>
-          <w:color w:val="000000"/>
-        </w:rPr>
-        <w:t>Founded in 1991, Canada Computers &amp; Electronics is a retailer of personal computers, IT and components, as well as consumer electronics.</w:t>
-      </w:r>
-    </w:p>
-    <w:p>
-      <w:pPr>
-        <w:pStyle w:val="Normal"/>
-        <w:rPr/>
-      </w:pPr>
-      <w:r>
-        <w:rPr>
-          <w:rStyle w:val="NormalItalic"/>
-          <w:rFonts w:cs="Calibri" w:ascii="Calibri" w:hAnsi="Calibri"/>
-          <w:lang w:val="en-CA"/>
-        </w:rPr>
-        <w:t>Customer Service Representative</w:t>
-      </w:r>
-      <w:r>
-        <w:rPr>
-          <w:rFonts w:cs="Calibri" w:ascii="Calibri" w:hAnsi="Calibri"/>
-          <w:lang w:val="en-CA"/>
-        </w:rPr>
-        <w:tab/>
-        <w:t>June 2014 – August 2015</w:t>
-      </w:r>
-    </w:p>
-    <w:p>
-      <w:pPr>
-        <w:pStyle w:val="ListParagraph"/>
-        <w:rPr/>
-      </w:pPr>
-      <w:r>
-        <w:rPr>
-          <w:rFonts w:cs="Calibri" w:ascii="Calibri" w:hAnsi="Calibri"/>
-          <w:u w:val="single"/>
-          <w:lang w:val="en-CA"/>
-        </w:rPr>
-        <w:t>Key Responsibilities</w:t>
-      </w:r>
-      <w:r>
-        <w:rPr>
-          <w:rFonts w:cs="Calibri" w:ascii="Calibri" w:hAnsi="Calibri"/>
-          <w:lang w:val="en-CA"/>
-        </w:rPr>
-        <w:t>:</w:t>
-      </w:r>
-    </w:p>
-    <w:p>
-      <w:pPr>
-        <w:pStyle w:val="ListParagraph"/>
-        <w:numPr>
-          <w:ilvl w:val="0"/>
-          <w:numId w:val="5"/>
-        </w:numPr>
-        <w:spacing w:before="0" w:after="0"/>
-        <w:rPr>
-          <w:rFonts w:ascii="Calibri" w:hAnsi="Calibri" w:cs="Calibri"/>
-          <w:lang w:val="en-CA"/>
-        </w:rPr>
-      </w:pPr>
-      <w:r>
-        <w:rPr>
-          <w:rFonts w:cs="Calibri" w:ascii="Calibri" w:hAnsi="Calibri"/>
-          <w:lang w:val="en-CA"/>
-        </w:rPr>
-        <w:t xml:space="preserve">Service Desk representative responsible for aiding clients with troubleshooting technical issues and suggesting appropriate solutions. </w:t>
-      </w:r>
-    </w:p>
-    <w:p>
-      <w:pPr>
-        <w:pStyle w:val="ListParagraph"/>
-        <w:numPr>
-          <w:ilvl w:val="0"/>
-          <w:numId w:val="5"/>
-        </w:numPr>
-        <w:spacing w:before="0" w:after="0"/>
-        <w:rPr>
-          <w:rFonts w:ascii="Calibri" w:hAnsi="Calibri" w:cs="Calibri"/>
-          <w:lang w:val="en-CA"/>
-        </w:rPr>
-      </w:pPr>
-      <w:r>
-        <w:rPr>
-          <w:rFonts w:cs="Calibri" w:ascii="Calibri" w:hAnsi="Calibri"/>
-          <w:lang w:val="en-CA"/>
-        </w:rPr>
-        <w:t>Responsible for assisting clients in finding the right software or hardware to meet their needs.</w:t>
-      </w:r>
-    </w:p>
-    <w:p>
-      <w:pPr>
-        <w:pStyle w:val="ListParagraph"/>
-        <w:numPr>
-          <w:ilvl w:val="0"/>
-          <w:numId w:val="5"/>
-        </w:numPr>
-        <w:spacing w:before="0" w:after="0"/>
-        <w:rPr>
-          <w:rFonts w:ascii="Calibri" w:hAnsi="Calibri" w:cs="Calibri"/>
-          <w:lang w:val="en-CA"/>
-        </w:rPr>
-      </w:pPr>
-      <w:r>
-        <w:rPr>
-          <w:rFonts w:cs="Calibri" w:ascii="Calibri" w:hAnsi="Calibri"/>
-          <w:lang w:val="en-CA"/>
-        </w:rPr>
-        <w:t>Used POS system to order required services and parts for pickup or delivery as well as inventory transfer between customer service department and sales.</w:t>
-      </w:r>
-    </w:p>
-    <w:p>
-      <w:pPr>
-        <w:pStyle w:val="ListParagraph"/>
-        <w:numPr>
-          <w:ilvl w:val="0"/>
-          <w:numId w:val="5"/>
-        </w:numPr>
-        <w:spacing w:before="0" w:after="0"/>
-        <w:rPr>
-          <w:rFonts w:ascii="Calibri" w:hAnsi="Calibri" w:cs="Calibri"/>
-          <w:lang w:val="en-CA"/>
-        </w:rPr>
-      </w:pPr>
-      <w:r>
-        <w:rPr>
-          <w:rFonts w:cs="Calibri" w:ascii="Calibri" w:hAnsi="Calibri"/>
-          <w:lang w:val="en-CA"/>
-        </w:rPr>
-        <w:t xml:space="preserve">Assisted in migrating  customers’ computers from Windows 8 to Windows 10 during transition period. </w:t>
-      </w:r>
-    </w:p>
-    <w:p>
-      <w:pPr>
-        <w:pStyle w:val="ListParagraph"/>
-        <w:numPr>
-          <w:ilvl w:val="0"/>
-          <w:numId w:val="5"/>
-        </w:numPr>
-        <w:spacing w:before="0" w:after="0"/>
-        <w:rPr>
-          <w:rFonts w:ascii="Calibri" w:hAnsi="Calibri" w:cs="Calibri"/>
-          <w:lang w:val="en-CA"/>
-        </w:rPr>
-      </w:pPr>
-      <w:r>
-        <w:rPr>
-          <w:rFonts w:cs="Calibri" w:ascii="Calibri" w:hAnsi="Calibri"/>
-          <w:lang w:val="en-CA"/>
-        </w:rPr>
-        <w:t>Assisted customers with Windows troubleshooting</w:t>
-      </w:r>
-    </w:p>
-    <w:p>
-      <w:pPr>
-        <w:pStyle w:val="ListParagraph"/>
-        <w:numPr>
-          <w:ilvl w:val="0"/>
-          <w:numId w:val="5"/>
-        </w:numPr>
-        <w:spacing w:before="0" w:after="0"/>
-        <w:rPr>
-          <w:rFonts w:ascii="Calibri" w:hAnsi="Calibri" w:cs="Calibri"/>
-          <w:lang w:val="en-CA"/>
-        </w:rPr>
-      </w:pPr>
-      <w:r>
-        <w:rPr>
-          <w:rFonts w:cs="Calibri" w:ascii="Calibri" w:hAnsi="Calibri"/>
-          <w:lang w:val="en-CA"/>
-        </w:rPr>
-        <w:t>Using MiniTool Partition Wizard, I backed up and migrated OS and files to new SSDs and HDDs.</w:t>
-      </w:r>
-    </w:p>
-    <w:p>
-      <w:pPr>
-        <w:pStyle w:val="Normal"/>
+        <w:pStyle w:val="ListParagraph"/>
+        <w:numPr>
+          <w:ilvl w:val="0"/>
+          <w:numId w:val="0"/>
+        </w:numPr>
+        <w:spacing w:before="0" w:after="0"/>
+        <w:ind w:left="360" w:hanging="0"/>
         <w:rPr>
           <w:rStyle w:val="NormalBold"/>
           <w:rFonts w:ascii="Calibri" w:hAnsi="Calibri" w:cs="Calibri"/>
@@ -2056,199 +2258,6 @@
           <w:lang w:val="en-CA"/>
         </w:rPr>
         <w:t>Tabulated votes completed all required paperwork, informed Elections Canada of polling station voting results and, returned the ballot box and related materials to Election Canada Office.</w:t>
-      </w:r>
-    </w:p>
-    <w:p>
-      <w:pPr>
-        <w:pStyle w:val="Normal"/>
-        <w:rPr/>
-      </w:pPr>
-      <w:r>
-        <w:rPr>
-          <w:rStyle w:val="NormalBold"/>
-          <w:rFonts w:cs="Calibri" w:ascii="Calibri" w:hAnsi="Calibri"/>
-          <w:lang w:val="en-CA"/>
-        </w:rPr>
-        <w:t>Fox Wireless</w:t>
-      </w:r>
-      <w:r>
-        <w:rPr>
-          <w:rFonts w:cs="Calibri" w:ascii="Calibri" w:hAnsi="Calibri"/>
-          <w:lang w:val="en-CA"/>
-        </w:rPr>
-        <w:tab/>
-        <w:t>Newmarket, ON, Canada</w:t>
-      </w:r>
-    </w:p>
-    <w:p>
-      <w:pPr>
-        <w:pStyle w:val="Normal"/>
-        <w:tabs>
-          <w:tab w:val="clear" w:pos="9360"/>
-          <w:tab w:val="left" w:pos="2955" w:leader="none"/>
-          <w:tab w:val="center" w:pos="4950" w:leader="none"/>
-          <w:tab w:val="right" w:pos="9900" w:leader="none"/>
-        </w:tabs>
-        <w:spacing w:before="0" w:after="0"/>
-        <w:textAlignment w:val="baseline"/>
-        <w:rPr>
-          <w:rFonts w:ascii="Calibri" w:hAnsi="Calibri" w:eastAsia="Times New Roman" w:cs="Calibri"/>
-          <w:kern w:val="0"/>
-          <w:lang w:eastAsia="en-CA"/>
-        </w:rPr>
-      </w:pPr>
-      <w:r>
-        <w:rPr>
-          <w:rFonts w:eastAsia="Times New Roman" w:cs="Calibri" w:ascii="Calibri" w:hAnsi="Calibri"/>
-          <w:kern w:val="0"/>
-          <w:lang w:eastAsia="en-CA"/>
-        </w:rPr>
-        <w:t xml:space="preserve">Fox Wireless Communications sold Telus mobiles, accessories and contracts. Moved to a new location when a new Telus store established nearby. I believe they are no longer operating. </w:t>
-      </w:r>
-    </w:p>
-    <w:p>
-      <w:pPr>
-        <w:pStyle w:val="Normal"/>
-        <w:rPr/>
-      </w:pPr>
-      <w:r>
-        <w:rPr>
-          <w:rStyle w:val="NormalItalic"/>
-          <w:rFonts w:cs="Calibri" w:ascii="Calibri" w:hAnsi="Calibri"/>
-          <w:lang w:val="en-CA"/>
-        </w:rPr>
-        <w:t>Sales Associate</w:t>
-      </w:r>
-      <w:r>
-        <w:rPr>
-          <w:rFonts w:cs="Calibri" w:ascii="Calibri" w:hAnsi="Calibri"/>
-          <w:lang w:val="en-CA"/>
-        </w:rPr>
-        <w:tab/>
-        <w:t>May 2008 – August 2008</w:t>
-      </w:r>
-    </w:p>
-    <w:p>
-      <w:pPr>
-        <w:pStyle w:val="Normal"/>
-        <w:tabs>
-          <w:tab w:val="clear" w:pos="9360"/>
-        </w:tabs>
-        <w:spacing w:before="0" w:after="0"/>
-        <w:textAlignment w:val="baseline"/>
-        <w:rPr/>
-      </w:pPr>
-      <w:r>
-        <w:rPr>
-          <w:rFonts w:eastAsia="Times New Roman" w:cs="Calibri" w:ascii="Calibri" w:hAnsi="Calibri"/>
-          <w:iCs/>
-          <w:kern w:val="0"/>
-          <w:u w:val="single"/>
-          <w:lang w:eastAsia="en-CA"/>
-        </w:rPr>
-        <w:t>Key Responsibilities</w:t>
-      </w:r>
-      <w:r>
-        <w:rPr>
-          <w:rFonts w:eastAsia="Times New Roman" w:cs="Calibri" w:ascii="Calibri" w:hAnsi="Calibri"/>
-          <w:i/>
-          <w:kern w:val="0"/>
-          <w:lang w:eastAsia="en-CA"/>
-        </w:rPr>
-        <w:t>:</w:t>
-      </w:r>
-    </w:p>
-    <w:p>
-      <w:pPr>
-        <w:pStyle w:val="Normal"/>
-        <w:keepNext w:val="true"/>
-        <w:numPr>
-          <w:ilvl w:val="0"/>
-          <w:numId w:val="6"/>
-        </w:numPr>
-        <w:tabs>
-          <w:tab w:val="clear" w:pos="9360"/>
-          <w:tab w:val="left" w:pos="-40" w:leader="none"/>
-          <w:tab w:val="left" w:pos="284" w:leader="none"/>
-        </w:tabs>
-        <w:spacing w:before="0" w:after="0"/>
-        <w:ind w:left="284" w:right="0" w:hanging="284"/>
-        <w:textAlignment w:val="baseline"/>
-        <w:rPr>
-          <w:rFonts w:ascii="Calibri" w:hAnsi="Calibri" w:eastAsia="Times New Roman" w:cs="Calibri"/>
-          <w:kern w:val="0"/>
-          <w:lang w:eastAsia="en-CA"/>
-        </w:rPr>
-      </w:pPr>
-      <w:r>
-        <w:rPr>
-          <w:rFonts w:eastAsia="Times New Roman" w:cs="Calibri" w:ascii="Calibri" w:hAnsi="Calibri"/>
-          <w:kern w:val="0"/>
-          <w:lang w:eastAsia="en-CA"/>
-        </w:rPr>
-        <w:t>Exceeded sales quota of Telus Mobile devices, contracts and accessories.</w:t>
-      </w:r>
-    </w:p>
-    <w:p>
-      <w:pPr>
-        <w:pStyle w:val="Normal"/>
-        <w:keepNext w:val="true"/>
-        <w:numPr>
-          <w:ilvl w:val="0"/>
-          <w:numId w:val="6"/>
-        </w:numPr>
-        <w:tabs>
-          <w:tab w:val="clear" w:pos="9360"/>
-          <w:tab w:val="left" w:pos="-40" w:leader="none"/>
-          <w:tab w:val="left" w:pos="284" w:leader="none"/>
-        </w:tabs>
-        <w:spacing w:before="0" w:after="0"/>
-        <w:ind w:left="284" w:right="0" w:hanging="284"/>
-        <w:textAlignment w:val="baseline"/>
-        <w:rPr>
-          <w:rFonts w:ascii="Calibri" w:hAnsi="Calibri" w:eastAsia="Times New Roman" w:cs="Calibri"/>
-          <w:kern w:val="0"/>
-          <w:lang w:eastAsia="en-CA"/>
-        </w:rPr>
-      </w:pPr>
-      <w:r>
-        <w:rPr>
-          <w:rFonts w:eastAsia="Times New Roman" w:cs="Calibri" w:ascii="Calibri" w:hAnsi="Calibri"/>
-          <w:kern w:val="0"/>
-          <w:lang w:eastAsia="en-CA"/>
-        </w:rPr>
-        <w:t xml:space="preserve">Assisted with store opening and closing duties. </w:t>
-      </w:r>
-    </w:p>
-    <w:p>
-      <w:pPr>
-        <w:pStyle w:val="Normal"/>
-        <w:keepNext w:val="true"/>
-        <w:numPr>
-          <w:ilvl w:val="0"/>
-          <w:numId w:val="6"/>
-        </w:numPr>
-        <w:tabs>
-          <w:tab w:val="clear" w:pos="9360"/>
-          <w:tab w:val="left" w:pos="-40" w:leader="none"/>
-          <w:tab w:val="left" w:pos="284" w:leader="none"/>
-        </w:tabs>
-        <w:spacing w:before="0" w:after="0"/>
-        <w:ind w:left="284" w:right="0" w:hanging="284"/>
-        <w:textAlignment w:val="baseline"/>
-        <w:rPr>
-          <w:rFonts w:ascii="Calibri" w:hAnsi="Calibri" w:eastAsia="Times New Roman" w:cs="Calibri"/>
-          <w:kern w:val="0"/>
-          <w:lang w:eastAsia="en-CA"/>
-        </w:rPr>
-      </w:pPr>
-      <w:r>
-        <w:rPr>
-          <w:rFonts w:eastAsia="Times New Roman" w:cs="Calibri" w:ascii="Calibri" w:hAnsi="Calibri"/>
-          <w:kern w:val="0"/>
-          <w:lang w:eastAsia="en-CA"/>
-        </w:rPr>
-        <w:t>Troubleshooted mobile related customer issues. Educated clients on usage and features of their new mobile devices.</w:t>
       </w:r>
     </w:p>
     <w:sectPr>
@@ -2358,7 +2367,7 @@
 </file>
 
 <file path=word/numbering.xml><?xml version="1.0" encoding="utf-8"?>
-<w:numbering xmlns:w="http://schemas.openxmlformats.org/wordprocessingml/2006/main" xmlns:o="urn:schemas-microsoft-com:office:office" xmlns:r="http://schemas.openxmlformats.org/officeDocument/2006/relationships" xmlns:v="urn:schemas-microsoft-com:vml">
+<w:numbering xmlns:w="http://schemas.openxmlformats.org/wordprocessingml/2006/main" xmlns:o="urn:schemas-microsoft-com:office:office" xmlns:r="http://schemas.openxmlformats.org/officeDocument/2006/relationships" xmlns:v="urn:schemas-microsoft-com:vml" xmlns:mc="http://schemas.openxmlformats.org/markup-compatibility/2006" xmlns:w14="http://schemas.microsoft.com/office/word/2010/wordml" mc:Ignorable="w14">
   <w:abstractNum w:abstractNumId="1">
     <w:lvl w:ilvl="0">
       <w:start w:val="1"/>
@@ -3023,143 +3032,6 @@
       </w:pPr>
       <w:rPr>
         <w:rFonts w:ascii="OpenSymbol" w:hAnsi="OpenSymbol" w:cs="OpenSymbol" w:hint="default"/>
-      </w:rPr>
-    </w:lvl>
-  </w:abstractNum>
-  <w:abstractNum w:abstractNumId="6">
-    <w:lvl w:ilvl="0">
-      <w:start w:val="1"/>
-      <w:numFmt w:val="bullet"/>
-      <w:lvlText w:val=""/>
-      <w:lvlJc w:val="left"/>
-      <w:pPr>
-        <w:tabs>
-          <w:tab w:val="num" w:pos="0"/>
-        </w:tabs>
-        <w:ind w:left="720" w:hanging="360"/>
-      </w:pPr>
-      <w:rPr>
-        <w:rFonts w:ascii="Symbol" w:hAnsi="Symbol" w:cs="Symbol" w:hint="default"/>
-      </w:rPr>
-    </w:lvl>
-    <w:lvl w:ilvl="1">
-      <w:start w:val="1"/>
-      <w:numFmt w:val="bullet"/>
-      <w:lvlText w:val="o"/>
-      <w:lvlJc w:val="left"/>
-      <w:pPr>
-        <w:tabs>
-          <w:tab w:val="num" w:pos="0"/>
-        </w:tabs>
-        <w:ind w:left="1440" w:hanging="360"/>
-      </w:pPr>
-      <w:rPr>
-        <w:rFonts w:ascii="Courier New" w:hAnsi="Courier New" w:cs="Courier New" w:hint="default"/>
-      </w:rPr>
-    </w:lvl>
-    <w:lvl w:ilvl="2">
-      <w:start w:val="1"/>
-      <w:numFmt w:val="bullet"/>
-      <w:lvlText w:val=""/>
-      <w:lvlJc w:val="left"/>
-      <w:pPr>
-        <w:tabs>
-          <w:tab w:val="num" w:pos="0"/>
-        </w:tabs>
-        <w:ind w:left="2160" w:hanging="360"/>
-      </w:pPr>
-      <w:rPr>
-        <w:rFonts w:ascii="Wingdings" w:hAnsi="Wingdings" w:cs="Wingdings" w:hint="default"/>
-      </w:rPr>
-    </w:lvl>
-    <w:lvl w:ilvl="3">
-      <w:start w:val="1"/>
-      <w:numFmt w:val="bullet"/>
-      <w:lvlText w:val=""/>
-      <w:lvlJc w:val="left"/>
-      <w:pPr>
-        <w:tabs>
-          <w:tab w:val="num" w:pos="0"/>
-        </w:tabs>
-        <w:ind w:left="2880" w:hanging="360"/>
-      </w:pPr>
-      <w:rPr>
-        <w:rFonts w:ascii="Symbol" w:hAnsi="Symbol" w:cs="Symbol" w:hint="default"/>
-      </w:rPr>
-    </w:lvl>
-    <w:lvl w:ilvl="4">
-      <w:start w:val="1"/>
-      <w:numFmt w:val="bullet"/>
-      <w:lvlText w:val="o"/>
-      <w:lvlJc w:val="left"/>
-      <w:pPr>
-        <w:tabs>
-          <w:tab w:val="num" w:pos="0"/>
-        </w:tabs>
-        <w:ind w:left="3600" w:hanging="360"/>
-      </w:pPr>
-      <w:rPr>
-        <w:rFonts w:ascii="Courier New" w:hAnsi="Courier New" w:cs="Courier New" w:hint="default"/>
-      </w:rPr>
-    </w:lvl>
-    <w:lvl w:ilvl="5">
-      <w:start w:val="1"/>
-      <w:numFmt w:val="bullet"/>
-      <w:lvlText w:val=""/>
-      <w:lvlJc w:val="left"/>
-      <w:pPr>
-        <w:tabs>
-          <w:tab w:val="num" w:pos="0"/>
-        </w:tabs>
-        <w:ind w:left="4320" w:hanging="360"/>
-      </w:pPr>
-      <w:rPr>
-        <w:rFonts w:ascii="Wingdings" w:hAnsi="Wingdings" w:cs="Wingdings" w:hint="default"/>
-      </w:rPr>
-    </w:lvl>
-    <w:lvl w:ilvl="6">
-      <w:start w:val="1"/>
-      <w:numFmt w:val="bullet"/>
-      <w:lvlText w:val=""/>
-      <w:lvlJc w:val="left"/>
-      <w:pPr>
-        <w:tabs>
-          <w:tab w:val="num" w:pos="0"/>
-        </w:tabs>
-        <w:ind w:left="5040" w:hanging="360"/>
-      </w:pPr>
-      <w:rPr>
-        <w:rFonts w:ascii="Symbol" w:hAnsi="Symbol" w:cs="Symbol" w:hint="default"/>
-      </w:rPr>
-    </w:lvl>
-    <w:lvl w:ilvl="7">
-      <w:start w:val="1"/>
-      <w:numFmt w:val="bullet"/>
-      <w:lvlText w:val="o"/>
-      <w:lvlJc w:val="left"/>
-      <w:pPr>
-        <w:tabs>
-          <w:tab w:val="num" w:pos="0"/>
-        </w:tabs>
-        <w:ind w:left="5760" w:hanging="360"/>
-      </w:pPr>
-      <w:rPr>
-        <w:rFonts w:ascii="Courier New" w:hAnsi="Courier New" w:cs="Courier New" w:hint="default"/>
-      </w:rPr>
-    </w:lvl>
-    <w:lvl w:ilvl="8">
-      <w:start w:val="1"/>
-      <w:numFmt w:val="bullet"/>
-      <w:lvlText w:val=""/>
-      <w:lvlJc w:val="left"/>
-      <w:pPr>
-        <w:tabs>
-          <w:tab w:val="num" w:pos="0"/>
-        </w:tabs>
-        <w:ind w:left="6480" w:hanging="360"/>
-      </w:pPr>
-      <w:rPr>
-        <w:rFonts w:ascii="Wingdings" w:hAnsi="Wingdings" w:cs="Wingdings" w:hint="default"/>
       </w:rPr>
     </w:lvl>
   </w:abstractNum>
@@ -3177,9 +3049,6 @@
   </w:num>
   <w:num w:numId="5">
     <w:abstractNumId w:val="5"/>
-  </w:num>
-  <w:num w:numId="6">
-    <w:abstractNumId w:val="6"/>
   </w:num>
 </w:numbering>
 </file>

</xml_diff>